<commit_message>
Remove "Your Rights" section from Privacy Notice
Delete Section 10 (Your rights) and renumber Children -> 10, Changes -> 11.
Regenerate docx to match.

Co-Authored-By: Claude Opus 4.8 <noreply@anthropic.com>
</commit_message>
<xml_diff>
--- a/MetaLeX Legal Docs/Web App ToS/MetaLeX-ToS-6.28.26.docx
+++ b/MetaLeX Legal Docs/Web App ToS/MetaLeX-ToS-6.28.26.docx
@@ -2146,53 +2146,6 @@
         </w:numPr>
       </w:pPr>
       <w:r>
-        <w:t xml:space="preserve">Your rights.</w:t>
-      </w:r>
-    </w:p>
-    <w:p>
-      <w:pPr>
-        <w:pStyle w:val="Compact"/>
-        <w:numPr>
-          <w:ilvl w:val="0"/>
-          <w:numId w:val="1015"/>
-        </w:numPr>
-      </w:pPr>
-      <w:r>
-        <w:t xml:space="preserve">EEA / UK / Switzerland. Subject to applicable law, you have the rights to access, rectify, erase, restrict and port your Personal Data, to object to Processing (including Processing based on legitimate interests and any direct-marketing analytics), and to withdraw consent at any time without affecting prior Processing. Our legal bases are: our legitimate interests in operating, securing, measuring and improving the Site (Art. 6(1)(f) GDPR); your consent for non-essential Cookies and Session Recordings where required (Art. 6(1)(a)); compliance with a legal obligation for sanctions and regulatory screening (Art. 6(1)(c)); and performance of a contract where Processing is necessary to provide the Site (Art. 6(1)(b)). You may lodge a complaint with your supervisory authority.</w:t>
-      </w:r>
-    </w:p>
-    <w:p>
-      <w:pPr>
-        <w:pStyle w:val="Compact"/>
-        <w:numPr>
-          <w:ilvl w:val="0"/>
-          <w:numId w:val="1015"/>
-        </w:numPr>
-      </w:pPr>
-      <w:r>
-        <w:t xml:space="preserve">California (CCPA/CPRA). We collect the categories of Personal Information described in Section 2 above for the purposes in Section 4. Our use of cross-context behavioral analytics and third-party analytics Cookies may constitute “sharing” (and, depending on configuration, a “sale”) of Personal Information under California law. Subject to applicable law, you have the right to know, to delete, to correct, and to opt out of the sale or sharing of your Personal Information. To the extent applicable law requires us to honor the Global Privacy Control or another opt-out preference signal, our policy is to do so. We do not knowingly sell or share the Personal Information of consumers we know to be under 16. We will not discriminate against you for exercising your rights.</w:t>
-      </w:r>
-    </w:p>
-    <w:p>
-      <w:pPr>
-        <w:pStyle w:val="Compact"/>
-        <w:numPr>
-          <w:ilvl w:val="0"/>
-          <w:numId w:val="1015"/>
-        </w:numPr>
-      </w:pPr>
-      <w:r>
-        <w:t xml:space="preserve">How to exercise. Submit requests to legal@metalex.tech, use the Analytics Provider’s opt-out where available, or set an opt-out preference signal in your browser. We will verify and respond to requests as required by applicable law. Because the Site is provided to sophisticated users on an as-is basis and we may have limited ability to associate analytics identifiers with a verified individual, some requests may require additional information to fulfill.</w:t>
-      </w:r>
-    </w:p>
-    <w:p>
-      <w:pPr>
-        <w:numPr>
-          <w:ilvl w:val="0"/>
-          <w:numId w:val="1016"/>
-        </w:numPr>
-      </w:pPr>
-      <w:r>
         <w:t xml:space="preserve">Children. The Site is not directed to, and may not be used by, anyone under 18. We do not knowingly Process the Personal Data of anyone under 18. If you believe a minor has provided Personal Data, contact legal@metalex.tech.</w:t>
       </w:r>
     </w:p>
@@ -2200,7 +2153,7 @@
       <w:pPr>
         <w:numPr>
           <w:ilvl w:val="0"/>
-          <w:numId w:val="1016"/>
+          <w:numId w:val="1014"/>
         </w:numPr>
       </w:pPr>
       <w:r>
@@ -2754,91 +2707,6 @@
     </w:lvl>
     <w:lvl w:ilvl="8">
       <w:start w:val="3"/>
-      <w:numFmt w:val="decimal"/>
-      <w:lvlText w:val="%9."/>
-      <w:lvlJc w:val="left"/>
-      <w:pPr>
-        <w:ind w:left="6480" w:hanging="360"/>
-      </w:pPr>
-    </w:lvl>
-  </w:abstractNum>
-  <w:abstractNum w:abstractNumId="994111">
-    <w:nsid w:val="0A994111"/>
-    <w:multiLevelType w:val="multilevel"/>
-    <w:lvl w:ilvl="0">
-      <w:start w:val="11"/>
-      <w:numFmt w:val="decimal"/>
-      <w:lvlText w:val="%1."/>
-      <w:lvlJc w:val="left"/>
-      <w:pPr>
-        <w:ind w:left="720" w:hanging="360"/>
-      </w:pPr>
-    </w:lvl>
-    <w:lvl w:ilvl="1">
-      <w:start w:val="11"/>
-      <w:numFmt w:val="decimal"/>
-      <w:lvlText w:val="%2."/>
-      <w:lvlJc w:val="left"/>
-      <w:pPr>
-        <w:ind w:left="1440" w:hanging="360"/>
-      </w:pPr>
-    </w:lvl>
-    <w:lvl w:ilvl="2">
-      <w:start w:val="11"/>
-      <w:numFmt w:val="decimal"/>
-      <w:lvlText w:val="%3."/>
-      <w:lvlJc w:val="left"/>
-      <w:pPr>
-        <w:ind w:left="2160" w:hanging="360"/>
-      </w:pPr>
-    </w:lvl>
-    <w:lvl w:ilvl="3">
-      <w:start w:val="11"/>
-      <w:numFmt w:val="decimal"/>
-      <w:lvlText w:val="%4."/>
-      <w:lvlJc w:val="left"/>
-      <w:pPr>
-        <w:ind w:left="2880" w:hanging="360"/>
-      </w:pPr>
-    </w:lvl>
-    <w:lvl w:ilvl="4">
-      <w:start w:val="11"/>
-      <w:numFmt w:val="decimal"/>
-      <w:lvlText w:val="%5."/>
-      <w:lvlJc w:val="left"/>
-      <w:pPr>
-        <w:ind w:left="3600" w:hanging="360"/>
-      </w:pPr>
-    </w:lvl>
-    <w:lvl w:ilvl="5">
-      <w:start w:val="11"/>
-      <w:numFmt w:val="decimal"/>
-      <w:lvlText w:val="%6."/>
-      <w:lvlJc w:val="left"/>
-      <w:pPr>
-        <w:ind w:left="4320" w:hanging="360"/>
-      </w:pPr>
-    </w:lvl>
-    <w:lvl w:ilvl="6">
-      <w:start w:val="11"/>
-      <w:numFmt w:val="decimal"/>
-      <w:lvlText w:val="%7."/>
-      <w:lvlJc w:val="left"/>
-      <w:pPr>
-        <w:ind w:left="5040" w:hanging="360"/>
-      </w:pPr>
-    </w:lvl>
-    <w:lvl w:ilvl="7">
-      <w:start w:val="11"/>
-      <w:numFmt w:val="decimal"/>
-      <w:lvlText w:val="%8."/>
-      <w:lvlJc w:val="left"/>
-      <w:pPr>
-        <w:ind w:left="5760" w:hanging="360"/>
-      </w:pPr>
-    </w:lvl>
-    <w:lvl w:ilvl="8">
-      <w:start w:val="11"/>
       <w:numFmt w:val="decimal"/>
       <w:lvlText w:val="%9."/>
       <w:lvlJc w:val="left"/>
@@ -3079,39 +2947,6 @@
     </w:lvlOverride>
     <w:lvlOverride w:ilvl="8">
       <w:startOverride w:val="3"/>
-    </w:lvlOverride>
-  </w:num>
-  <w:num w:numId="1015">
-    <w:abstractNumId w:val="991"/>
-  </w:num>
-  <w:num w:numId="1016">
-    <w:abstractNumId w:val="994111"/>
-    <w:lvlOverride w:ilvl="0">
-      <w:startOverride w:val="11"/>
-    </w:lvlOverride>
-    <w:lvlOverride w:ilvl="1">
-      <w:startOverride w:val="11"/>
-    </w:lvlOverride>
-    <w:lvlOverride w:ilvl="2">
-      <w:startOverride w:val="11"/>
-    </w:lvlOverride>
-    <w:lvlOverride w:ilvl="3">
-      <w:startOverride w:val="11"/>
-    </w:lvlOverride>
-    <w:lvlOverride w:ilvl="4">
-      <w:startOverride w:val="11"/>
-    </w:lvlOverride>
-    <w:lvlOverride w:ilvl="5">
-      <w:startOverride w:val="11"/>
-    </w:lvlOverride>
-    <w:lvlOverride w:ilvl="6">
-      <w:startOverride w:val="11"/>
-    </w:lvlOverride>
-    <w:lvlOverride w:ilvl="7">
-      <w:startOverride w:val="11"/>
-    </w:lvlOverride>
-    <w:lvlOverride w:ilvl="8">
-      <w:startOverride w:val="11"/>
     </w:lvlOverride>
   </w:num>
 </w:numbering>

</xml_diff>